<commit_message>
TP1083: fiabilise l'enquête SST et les ressources DUERP
</commit_message>
<xml_diff>
--- a/bts-gpme/tp-1083/ressources/R03_DUERP_extrait_cotation_prevention.docx
+++ b/bts-gpme/tp-1083/ressources/R03_DUERP_extrait_cotation_prevention.docx
@@ -19,7 +19,7 @@
           <w:color w:val="C00000"/>
           <w:sz w:val="36"/>
         </w:rPr>
-        <w:t>R03 â€” DUERP : extrait de travail, cotation et prÃ©vention</w:t>
+        <w:t>R03 — DUERP : extrait de travail, cotation et prévention</w:t>
       </w:r>
     </w:p>
     <w:p>
@@ -39,7 +39,7 @@
           <w:color w:val="000000"/>
           <w:sz w:val="18"/>
         </w:rPr>
-        <w:t>DOCUMENT CRÃ‰Ã‰ POUR LE TP â€” Les situations, mesures et Ã©valuations ci-dessous sont fictives et ne dÃ©crivent pas le DUERP rÃ©el de 1083.</w:t>
+        <w:t>DOCUMENT CRÉÉ POUR LE TP — Les situations, mesures et évaluations ci-dessous sont fictives et ne décrivent pas le DUERP réel de 1083.</w:t>
       </w:r>
     </w:p>
     <w:p>
@@ -58,7 +58,7 @@
           <w:color w:val="000000"/>
           <w:sz w:val="28"/>
         </w:rPr>
-        <w:t>1. Extrait du DUERP avant rÃ©Ã©valuation â€” situation au 15/09/2026</w:t>
+        <w:t>1. Extrait du DUERP avant réévaluation — situation au 15/09/2026</w:t>
       </w:r>
     </w:p>
     <w:tbl>
@@ -112,7 +112,7 @@
                 <w:color w:val="000000"/>
                 <w:sz w:val="15"/>
               </w:rPr>
-              <w:t>UnitÃ© de travail</w:t>
+              <w:t>Unité de travail</w:t>
             </w:r>
           </w:p>
         </w:tc>
@@ -160,7 +160,7 @@
                 <w:color w:val="000000"/>
                 <w:sz w:val="15"/>
               </w:rPr>
-              <w:t>Risque identifiÃ©</w:t>
+              <w:t>Risque identifié</w:t>
             </w:r>
           </w:p>
         </w:tc>
@@ -184,7 +184,7 @@
                 <w:color w:val="000000"/>
                 <w:sz w:val="15"/>
               </w:rPr>
-              <w:t>Mesures indiquÃ©es dans ancien DUERP</w:t>
+              <w:t>Mesures indiquées dans ancien DUERP</w:t>
             </w:r>
           </w:p>
         </w:tc>
@@ -208,7 +208,7 @@
                 <w:color w:val="000000"/>
                 <w:sz w:val="15"/>
               </w:rPr>
-              <w:t>Ã‰valuation prÃ©cÃ©dente</w:t>
+              <w:t>Évaluation précédente</w:t>
             </w:r>
           </w:p>
         </w:tc>
@@ -312,7 +312,7 @@
                 <w:color w:val="000000"/>
                 <w:sz w:val="15"/>
               </w:rPr>
-              <w:t>Protecteur ; arrÃªt urgence ; consignes</w:t>
+              <w:t>Protecteur ; arrêt urgence ; consignes</w:t>
             </w:r>
           </w:p>
         </w:tc>
@@ -392,7 +392,7 @@
                 <w:color w:val="000000"/>
                 <w:sz w:val="15"/>
               </w:rPr>
-              <w:t>Gestes rÃ©pÃ©titifs et posture</w:t>
+              <w:t>Gestes répétitifs et posture</w:t>
             </w:r>
           </w:p>
         </w:tc>
@@ -440,7 +440,7 @@
                 <w:color w:val="000000"/>
                 <w:sz w:val="15"/>
               </w:rPr>
-              <w:t>SiÃ¨ges rÃ©glables ; pauses libres</w:t>
+              <w:t>Sièges réglables ; pauses libres</w:t>
             </w:r>
           </w:p>
         </w:tc>
@@ -496,7 +496,7 @@
                 <w:color w:val="000000"/>
                 <w:sz w:val="15"/>
               </w:rPr>
-              <w:t>RÃ©ception / stock</w:t>
+              <w:t>Réception / stock</w:t>
             </w:r>
           </w:p>
         </w:tc>
@@ -624,7 +624,7 @@
                 <w:color w:val="000000"/>
                 <w:sz w:val="15"/>
               </w:rPr>
-              <w:t>RÃ©ception / stock</w:t>
+              <w:t>Réception / stock</w:t>
             </w:r>
           </w:p>
         </w:tc>
@@ -752,7 +752,7 @@
                 <w:color w:val="000000"/>
                 <w:sz w:val="15"/>
               </w:rPr>
-              <w:t>RÃ©ception / stock</w:t>
+              <w:t>Réception / stock</w:t>
             </w:r>
           </w:p>
         </w:tc>
@@ -776,7 +776,7 @@
                 <w:color w:val="000000"/>
                 <w:sz w:val="15"/>
               </w:rPr>
-              <w:t>RÃ©ception et stabilitÃ© des charges</w:t>
+              <w:t>Réception et stabilité des charges</w:t>
             </w:r>
           </w:p>
         </w:tc>
@@ -824,7 +824,7 @@
                 <w:color w:val="000000"/>
                 <w:sz w:val="15"/>
               </w:rPr>
-              <w:t>ContrÃ´le visuel des palettes</w:t>
+              <w:t>Contrôle visuel des palettes</w:t>
             </w:r>
           </w:p>
         </w:tc>
@@ -880,7 +880,7 @@
                 <w:color w:val="000000"/>
                 <w:sz w:val="15"/>
               </w:rPr>
-              <w:t>E-commerce / prÃ©paration</w:t>
+              <w:t>E-commerce / préparation</w:t>
             </w:r>
           </w:p>
         </w:tc>
@@ -904,7 +904,7 @@
                 <w:color w:val="000000"/>
                 <w:sz w:val="15"/>
               </w:rPr>
-              <w:t>Postures, rÃ©pÃ©titivitÃ©, table fixe</w:t>
+              <w:t>Postures, répétitivité, table fixe</w:t>
             </w:r>
           </w:p>
         </w:tc>
@@ -1008,7 +1008,7 @@
                 <w:color w:val="000000"/>
                 <w:sz w:val="15"/>
               </w:rPr>
-              <w:t>E-commerce / prÃ©paration</w:t>
+              <w:t>E-commerce / préparation</w:t>
             </w:r>
           </w:p>
         </w:tc>
@@ -1080,7 +1080,7 @@
                 <w:color w:val="000000"/>
                 <w:sz w:val="15"/>
               </w:rPr>
-              <w:t>DÃ©marche 5S en cours</w:t>
+              <w:t>Démarche 5S en cours</w:t>
             </w:r>
           </w:p>
         </w:tc>
@@ -1160,7 +1160,7 @@
                 <w:color w:val="000000"/>
                 <w:sz w:val="15"/>
               </w:rPr>
-              <w:t>Sol et zone entrÃ©e</w:t>
+              <w:t>Sol et zone entrée</w:t>
             </w:r>
           </w:p>
         </w:tc>
@@ -1288,7 +1288,7 @@
                 <w:color w:val="000000"/>
                 <w:sz w:val="15"/>
               </w:rPr>
-              <w:t>RÃ©serve et Ã©tagÃ¨res hautes</w:t>
+              <w:t>Réserve et étagères hautes</w:t>
             </w:r>
           </w:p>
         </w:tc>
@@ -1390,7 +1390,7 @@
           <w:color w:val="000000"/>
           <w:sz w:val="18"/>
         </w:rPr>
-        <w:t>Lecture : la cotation prÃ©cÃ©dente constitue seulement un repÃ¨re historique. Les mesures inscrites au document ne prouvent ni leur disponibilitÃ© rÃ©elle, ni leur utilisation, ni leur efficacitÃ©.</w:t>
+        <w:t>Lecture : la cotation précédente constitue seulement un repère historique. Les mesures inscrites au document ne prouvent ni leur disponibilité réelle, ni leur utilisation, ni leur efficacité.</w:t>
       </w:r>
     </w:p>
     <w:p>
@@ -1426,7 +1426,7 @@
           <w:color w:val="000000"/>
           <w:sz w:val="28"/>
         </w:rPr>
-        <w:t>2. Historique et Ã©tat des mesures de prÃ©vention</w:t>
+        <w:t>2. Historique et état des mesures de prévention</w:t>
       </w:r>
     </w:p>
     <w:p>
@@ -1443,7 +1443,7 @@
           <w:color w:val="000000"/>
           <w:sz w:val="19"/>
         </w:rPr>
-        <w:t>Croisez les dates des Ã©vÃ©nements de R02 avec celles des mesures. Une mesure mise en Å“uvre aprÃ¨s un Ã©vÃ©nement ne peut pas expliquer la maÃ®trise antÃ©rieure du risque. Une mesure prÃ©vue mais non rÃ©alisÃ©e ne rÃ©duit pas le risque actuel. Une mesure en place doit encore Ãªtre Ã©valuÃ©e.</w:t>
+        <w:t>Croisez les dates des événements de R02 avec celles des mesures. Une mesure mise en œuvre après un événement ne peut pas expliquer la maîtrise antérieure du risque. Une mesure prévue mais non réalisée ne réduit pas le risque actuel. Une mesure en place doit encore être évaluée.</w:t>
       </w:r>
     </w:p>
     <w:tbl>
@@ -1544,7 +1544,7 @@
                 <w:color w:val="000000"/>
                 <w:sz w:val="14"/>
               </w:rPr>
-              <w:t>Ã‰lÃ©ment efficacitÃ©</w:t>
+              <w:t>Élément efficacité</w:t>
             </w:r>
           </w:p>
         </w:tc>
@@ -1620,7 +1620,7 @@
                 <w:color w:val="000000"/>
                 <w:sz w:val="14"/>
               </w:rPr>
-              <w:t>Protecteur â€” 02/09/2024, en service</w:t>
+              <w:t>Protecteur — 02/09/2024, en service</w:t>
             </w:r>
           </w:p>
         </w:tc>
@@ -1642,7 +1642,7 @@
                 <w:color w:val="000000"/>
                 <w:sz w:val="14"/>
               </w:rPr>
-              <w:t>Presque-accident 19/01/2026 lors dÃ©gagement tissu</w:t>
+              <w:t>Presque-accident 19/01/2026 lors dégagement tissu</w:t>
             </w:r>
           </w:p>
         </w:tc>
@@ -1664,7 +1664,7 @@
                 <w:color w:val="000000"/>
                 <w:sz w:val="14"/>
               </w:rPr>
-              <w:t>EfficacitÃ© Ã  approfondir</w:t>
+              <w:t>Efficacité à approfondir</w:t>
             </w:r>
           </w:p>
         </w:tc>
@@ -1716,7 +1716,7 @@
                 <w:color w:val="000000"/>
                 <w:sz w:val="14"/>
               </w:rPr>
-              <w:t>ArrÃªt urgence â€” 02/09/2024 ; maintenance 05/10/2026</w:t>
+              <w:t>Arrêt urgence — 02/09/2024 ; maintenance 05/10/2026</w:t>
             </w:r>
           </w:p>
         </w:tc>
@@ -1738,7 +1738,7 @@
                 <w:color w:val="000000"/>
                 <w:sz w:val="14"/>
               </w:rPr>
-              <w:t>Test 03/09/2026 : rÃ©action trop longue</w:t>
+              <w:t>Test 03/09/2026 : réaction trop longue</w:t>
             </w:r>
           </w:p>
         </w:tc>
@@ -1760,7 +1760,7 @@
                 <w:color w:val="000000"/>
                 <w:sz w:val="14"/>
               </w:rPr>
-              <w:t>Anomalie connue ; correction Ã  vÃ©rifier</w:t>
+              <w:t>Anomalie connue ; correction à vérifier</w:t>
             </w:r>
           </w:p>
         </w:tc>
@@ -1812,7 +1812,7 @@
                 <w:color w:val="000000"/>
                 <w:sz w:val="14"/>
               </w:rPr>
-              <w:t>SiÃ¨ges rÃ©glables â€” 10/11/2025</w:t>
+              <w:t>Sièges réglables — 10/11/2025</w:t>
             </w:r>
           </w:p>
         </w:tc>
@@ -1834,7 +1834,7 @@
                 <w:color w:val="000000"/>
                 <w:sz w:val="14"/>
               </w:rPr>
-              <w:t>Douleurs 03/02 et 09/07 ; rÃ©glages non tracÃ©s</w:t>
+              <w:t>Douleurs 03/02 et 09/07 ; réglages non tracés</w:t>
             </w:r>
           </w:p>
         </w:tc>
@@ -1856,7 +1856,7 @@
                 <w:color w:val="000000"/>
                 <w:sz w:val="14"/>
               </w:rPr>
-              <w:t>PrÃ©sence ne prouve pas efficacitÃ©</w:t>
+              <w:t>Présence ne prouve pas efficacité</w:t>
             </w:r>
           </w:p>
         </w:tc>
@@ -1886,7 +1886,7 @@
                 <w:color w:val="000000"/>
                 <w:sz w:val="14"/>
               </w:rPr>
-              <w:t>RÃ©ception manutention</w:t>
+              <w:t>Réception manutention</w:t>
             </w:r>
           </w:p>
         </w:tc>
@@ -1908,7 +1908,7 @@
                 <w:color w:val="000000"/>
                 <w:sz w:val="14"/>
               </w:rPr>
-              <w:t>Diable / chariots â€” 15/06/2025</w:t>
+              <w:t>Diable / chariots — 15/06/2025</w:t>
             </w:r>
           </w:p>
         </w:tc>
@@ -1930,7 +1930,7 @@
                 <w:color w:val="000000"/>
                 <w:sz w:val="14"/>
               </w:rPr>
-              <w:t>Ã‰vÃ©nement 26/02 : diable Ã©loignÃ©</w:t>
+              <w:t>Événement 26/02 : diable éloigné</w:t>
             </w:r>
           </w:p>
         </w:tc>
@@ -1952,7 +1952,7 @@
                 <w:color w:val="000000"/>
                 <w:sz w:val="14"/>
               </w:rPr>
-              <w:t>AccessibilitÃ© rÃ©elle Ã  vÃ©rifier</w:t>
+              <w:t>Accessibilité réelle à vérifier</w:t>
             </w:r>
           </w:p>
         </w:tc>
@@ -1982,7 +1982,7 @@
                 <w:color w:val="000000"/>
                 <w:sz w:val="14"/>
               </w:rPr>
-              <w:t>RÃ©ception circulation</w:t>
+              <w:t>Réception circulation</w:t>
             </w:r>
           </w:p>
         </w:tc>
@@ -2004,7 +2004,7 @@
                 <w:color w:val="000000"/>
                 <w:sz w:val="14"/>
               </w:rPr>
-              <w:t>Marquage â€” 15/05/2026, partiel</w:t>
+              <w:t>Marquage — 15/05/2026, partiel</w:t>
             </w:r>
           </w:p>
         </w:tc>
@@ -2026,7 +2026,7 @@
                 <w:color w:val="000000"/>
                 <w:sz w:val="14"/>
               </w:rPr>
-              <w:t>Presque-accident 28/05 dans allÃ©e encombrÃ©e</w:t>
+              <w:t>Presque-accident 28/05 dans allée encombrée</w:t>
             </w:r>
           </w:p>
         </w:tc>
@@ -2078,7 +2078,7 @@
                 <w:color w:val="000000"/>
                 <w:sz w:val="14"/>
               </w:rPr>
-              <w:t>RÃ©ception chute objet</w:t>
+              <w:t>Réception chute objet</w:t>
             </w:r>
           </w:p>
         </w:tc>
@@ -2100,7 +2100,7 @@
                 <w:color w:val="000000"/>
                 <w:sz w:val="14"/>
               </w:rPr>
-              <w:t>ContrÃ´le palettes â€” 01/08/2026, aprÃ¨s Ã©vÃ©nement 24/07</w:t>
+              <w:t>Contrôle palettes — 01/08/2026, après événement 24/07</w:t>
             </w:r>
           </w:p>
         </w:tc>
@@ -2122,7 +2122,7 @@
                 <w:color w:val="000000"/>
                 <w:sz w:val="14"/>
               </w:rPr>
-              <w:t>Aucun Ã©vÃ©nement ultÃ©rieur disponible</w:t>
+              <w:t>Aucun événement ultérieur disponible</w:t>
             </w:r>
           </w:p>
         </w:tc>
@@ -2144,7 +2144,7 @@
                 <w:color w:val="000000"/>
                 <w:sz w:val="14"/>
               </w:rPr>
-              <w:t>Trop tÃ´t pour conclure</w:t>
+              <w:t>Trop tôt pour conclure</w:t>
             </w:r>
           </w:p>
         </w:tc>
@@ -2196,7 +2196,7 @@
                 <w:color w:val="000000"/>
                 <w:sz w:val="14"/>
               </w:rPr>
-              <w:t>Rappel ergonomique â€” 15/04/2026</w:t>
+              <w:t>Rappel ergonomique — 15/04/2026</w:t>
             </w:r>
           </w:p>
         </w:tc>
@@ -2218,7 +2218,7 @@
                 <w:color w:val="000000"/>
                 <w:sz w:val="14"/>
               </w:rPr>
-              <w:t>GÃªne lombaire 29/04</w:t>
+              <w:t>Gêne lombaire 29/04</w:t>
             </w:r>
           </w:p>
         </w:tc>
@@ -2240,7 +2240,7 @@
                 <w:color w:val="000000"/>
                 <w:sz w:val="14"/>
               </w:rPr>
-              <w:t>EfficacitÃ© Ã  vÃ©rifier</w:t>
+              <w:t>Efficacité à vérifier</w:t>
             </w:r>
           </w:p>
         </w:tc>
@@ -2292,7 +2292,7 @@
                 <w:color w:val="000000"/>
                 <w:sz w:val="14"/>
               </w:rPr>
-              <w:t>5S â€” 01/09/2026, pilote</w:t>
+              <w:t>5S — 01/09/2026, pilote</w:t>
             </w:r>
           </w:p>
         </w:tc>
@@ -2336,7 +2336,7 @@
                 <w:color w:val="000000"/>
                 <w:sz w:val="14"/>
               </w:rPr>
-              <w:t>MaÃ®trise non dÃ©montrÃ©e</w:t>
+              <w:t>Maîtrise non démontrée</w:t>
             </w:r>
           </w:p>
         </w:tc>
@@ -2388,7 +2388,7 @@
                 <w:color w:val="000000"/>
                 <w:sz w:val="14"/>
               </w:rPr>
-              <w:t>Tapis â€” 01/10/2024</w:t>
+              <w:t>Tapis — 01/10/2024</w:t>
             </w:r>
           </w:p>
         </w:tc>
@@ -2484,7 +2484,7 @@
                 <w:color w:val="000000"/>
                 <w:sz w:val="14"/>
               </w:rPr>
-              <w:t>Escabeau â€” 01/10/2025, autre rÃ©serve</w:t>
+              <w:t>Escabeau — 01/10/2025, autre réserve</w:t>
             </w:r>
           </w:p>
         </w:tc>
@@ -2506,7 +2506,7 @@
                 <w:color w:val="000000"/>
                 <w:sz w:val="14"/>
               </w:rPr>
-              <w:t>Ã‰vÃ©nement 25/08 avec tabouret</w:t>
+              <w:t>Événement 25/08 avec tabouret</w:t>
             </w:r>
           </w:p>
         </w:tc>
@@ -2528,7 +2528,7 @@
                 <w:color w:val="000000"/>
                 <w:sz w:val="14"/>
               </w:rPr>
-              <w:t>AccessibilitÃ© insuffisante</w:t>
+              <w:t>Accessibilité insuffisante</w:t>
             </w:r>
           </w:p>
         </w:tc>
@@ -2576,7 +2576,7 @@
           <w:color w:val="000000"/>
           <w:sz w:val="28"/>
         </w:rPr>
-        <w:t>3. Ã‰chelle de cotation utilisÃ©e dans le TP</w:t>
+        <w:t>3. Échelle de cotation utilisée dans le TP</w:t>
       </w:r>
     </w:p>
     <w:p>
@@ -2593,7 +2593,7 @@
           <w:color w:val="000000"/>
           <w:sz w:val="19"/>
         </w:rPr>
-        <w:t>La cotation est une mÃ©thode interne de priorisation. La frÃ©quence exposition est un indice pour apprÃ©cier P ; elle ne se confond pas avec P. La gravitÃ© correspond au dommage potentiel plausible, pas seulement au dommage observÃ© lors du dernier Ã©vÃ©nement.</w:t>
+        <w:t>La cotation est une méthode interne de priorisation. La fréquence exposition est un indice pour apprécier P ; elle ne se confond pas avec P. La gravité correspond au dommage potentiel plausible, pas seulement au dommage observé lors du dernier événement.</w:t>
       </w:r>
     </w:p>
     <w:tbl>
@@ -2669,7 +2669,7 @@
                 <w:color w:val="000000"/>
                 <w:sz w:val="17"/>
               </w:rPr>
-              <w:t>ProbabilitÃ© / vraisemblance</w:t>
+              <w:t>Probabilité / vraisemblance</w:t>
             </w:r>
           </w:p>
         </w:tc>
@@ -2693,7 +2693,7 @@
                 <w:color w:val="000000"/>
                 <w:sz w:val="17"/>
               </w:rPr>
-              <w:t>GravitÃ© potentielle</w:t>
+              <w:t>Gravité potentielle</w:t>
             </w:r>
           </w:p>
         </w:tc>
@@ -2767,7 +2767,7 @@
                 <w:color w:val="000000"/>
                 <w:sz w:val="17"/>
               </w:rPr>
-              <w:t>Effet faible ou dommage rÃ©versible sans arrÃªt</w:t>
+              <w:t>Effet faible ou dommage réversible sans arrêt</w:t>
             </w:r>
           </w:p>
         </w:tc>
@@ -2841,7 +2841,7 @@
                 <w:color w:val="000000"/>
                 <w:sz w:val="17"/>
               </w:rPr>
-              <w:t>Dommage limitÃ©, soins ou arrÃªt court</w:t>
+              <w:t>Dommage limité, soins ou arrêt court</w:t>
             </w:r>
           </w:p>
         </w:tc>
@@ -2989,7 +2989,7 @@
                 <w:color w:val="000000"/>
                 <w:sz w:val="17"/>
               </w:rPr>
-              <w:t>Dommage grave / arrÃªt important</w:t>
+              <w:t>Dommage grave / arrêt important</w:t>
             </w:r>
           </w:p>
         </w:tc>
@@ -3041,7 +3041,7 @@
                 <w:color w:val="000000"/>
                 <w:sz w:val="17"/>
               </w:rPr>
-              <w:t>TrÃ¨s probable / rÃ©currente</w:t>
+              <w:t>Très probable / récurrente</w:t>
             </w:r>
           </w:p>
         </w:tc>
@@ -3063,7 +3063,7 @@
                 <w:color w:val="000000"/>
                 <w:sz w:val="17"/>
               </w:rPr>
-              <w:t>Dommage critique : incapacitÃ©, risque vital ou consÃ©quence majeure</w:t>
+              <w:t>Dommage critique : incapacité, risque vital ou conséquence majeure</w:t>
             </w:r>
           </w:p>
         </w:tc>
@@ -3094,7 +3094,7 @@
           <w:color w:val="C00000"/>
           <w:sz w:val="19"/>
         </w:rPr>
-        <w:t>RÃˆGLE DE VIGILANCE â€” Tout risque de gravitÃ© 5 doit faire objet dâ€™un examen spÃ©cifique, mÃªme si sa probabilitÃ© est faible.</w:t>
+        <w:t>RÈGLE DE VIGILANCE — Tout risque de gravité 5 doit faire objet d’un examen spécifique, même si sa probabilité est faible.</w:t>
       </w:r>
     </w:p>
     <w:p>
@@ -3113,7 +3113,7 @@
           <w:color w:val="000000"/>
           <w:sz w:val="28"/>
         </w:rPr>
-        <w:t>4. HiÃ©rarchie pratique des actions Ã  discuter</w:t>
+        <w:t>4. Hiérarchie pratique des actions à discuter</w:t>
       </w:r>
     </w:p>
     <w:p>
@@ -3131,7 +3131,7 @@
           <w:color w:val="000000"/>
           <w:sz w:val="19"/>
         </w:rPr>
-        <w:t>â€¢ Supprimer le danger ou Ã©viter exposition lorsquâ€™une solution rÃ©aliste existe.</w:t>
+        <w:t>• Supprimer le danger ou éviter exposition lorsqu’une solution réaliste existe.</w:t>
       </w:r>
     </w:p>
     <w:p>
@@ -3149,7 +3149,7 @@
           <w:color w:val="000000"/>
           <w:sz w:val="19"/>
         </w:rPr>
-        <w:t>â€¢ PrivilÃ©gier la protection collective et organisationnelle avant de compter uniquement sur un Ã©quipement individuel.</w:t>
+        <w:t>• Privilégier la protection collective et organisationnelle avant de compter uniquement sur un équipement individuel.</w:t>
       </w:r>
     </w:p>
     <w:p>
@@ -3167,7 +3167,7 @@
           <w:color w:val="000000"/>
           <w:sz w:val="19"/>
         </w:rPr>
-        <w:t>â€¢ DÃ©finir un responsable, un dÃ©lai, une preuve de rÃ©alisation et un indicateur efficacitÃ© pour chaque action.</w:t>
+        <w:t>• Définir un responsable, un délai, une preuve de réalisation et un indicateur efficacité pour chaque action.</w:t>
       </w:r>
     </w:p>
     <w:p>
@@ -3184,7 +3184,7 @@
           <w:color w:val="000000"/>
           <w:sz w:val="19"/>
         </w:rPr>
-        <w:t>â€¢ PrÃ©voir la date du nouvel examen du risque aprÃ¨s mise en Å“uvre.</w:t>
+        <w:t>• Prévoir la date du nouvel examen du risque après mise en œuvre.</w:t>
       </w:r>
     </w:p>
     <w:p>
@@ -3203,7 +3203,7 @@
           <w:color w:val="000000"/>
           <w:sz w:val="28"/>
         </w:rPr>
-        <w:t>5. Point de droit Ã  vÃ©rifier</w:t>
+        <w:t>5. Point de droit à vérifier</w:t>
       </w:r>
     </w:p>
     <w:p>
@@ -3221,7 +3221,7 @@
           <w:color w:val="000000"/>
           <w:sz w:val="19"/>
         </w:rPr>
-        <w:t>Pour la tÃ¢che 9, vÃ©rifiez sur une source institutionnelle les cas de mise Ã  jour du DUERP ainsi que la conservation et la traÃ§abilitÃ© des versions successives. Relevez la rÃ¨gle utile, citez la source et datez votre consultation. Une recherche libre nâ€™est pas attendue.</w:t>
+        <w:t>Pour la tâche 9, vérifiez sur une source institutionnelle les cas de mise à jour du DUERP ainsi que la conservation et la traçabilité des versions successives. Relevez la règle utile, citez la source et datez votre consultation. Une recherche libre n’est pas attendue.</w:t>
       </w:r>
     </w:p>
     <w:p>
@@ -3239,7 +3239,7 @@
           <w:color w:val="000000"/>
           <w:sz w:val="18"/>
         </w:rPr>
-        <w:t>Sources ciblÃ©es : Code du travail, art. R4121-2 et R4121-4 sur LÃ©gifrance ; MinistÃ¨re du Travail â€” page DUERP.</w:t>
+        <w:t>Sources ciblées : Code du travail, art. R4121-2 et R4121-4 sur Légifrance ; Ministère du Travail — page DUERP.</w:t>
       </w:r>
     </w:p>
     <w:p>
@@ -3257,7 +3257,7 @@
           <w:color w:val="000000"/>
           <w:sz w:val="17"/>
         </w:rPr>
-        <w:t>LÃ©gifrance R4121-2 : https://www.legifrance.gouv.fr/codes/article_lc/LEGIARTI000045386446</w:t>
+        <w:t>Légifrance R4121-2 : https://www.legifrance.gouv.fr/codes/article_lc/LEGIARTI000045386446</w:t>
       </w:r>
     </w:p>
     <w:p>
@@ -3275,7 +3275,7 @@
           <w:color w:val="000000"/>
           <w:sz w:val="17"/>
         </w:rPr>
-        <w:t>MinistÃ¨re du Travail â€” DUERP : https://travail-emploi.gouv.fr/le-document-unique-devaluation-des-risques-professionnels-duerp</w:t>
+        <w:t>Ministère du Travail — DUERP : https://travail-emploi.gouv.fr/le-document-unique-devaluation-des-risques-professionnels-duerp</w:t>
       </w:r>
     </w:p>
     <w:p>

</xml_diff>

<commit_message>
Mise à jours fiches BTS et TP 1083
</commit_message>
<xml_diff>
--- a/bts-gpme/tp-1083/ressources/R03_DUERP_extrait_cotation_prevention.docx
+++ b/bts-gpme/tp-1083/ressources/R03_DUERP_extrait_cotation_prevention.docx
@@ -19,7 +19,7 @@
           <w:color w:val="C00000"/>
           <w:sz w:val="36"/>
         </w:rPr>
-        <w:t>R03 â€” DUERP : extrait de travail, cotation et prÃ©vention</w:t>
+        <w:t>R03 — DUERP : extrait de travail, cotation et prévention</w:t>
       </w:r>
     </w:p>
     <w:p>
@@ -39,7 +39,7 @@
           <w:color w:val="000000"/>
           <w:sz w:val="18"/>
         </w:rPr>
-        <w:t>DOCUMENT CRÃ‰Ã‰ POUR LE TP â€” Les situations, mesures et Ã©valuations ci-dessous sont fictives et ne dÃ©crivent pas le DUERP rÃ©el de 1083.</w:t>
+        <w:t>DOCUMENT CRÉÉ POUR LE TP — Les situations, mesures et évaluations ci-dessous sont fictives et ne décrivent pas le DUERP réel de 1083.</w:t>
       </w:r>
     </w:p>
     <w:p>
@@ -58,7 +58,7 @@
           <w:color w:val="000000"/>
           <w:sz w:val="28"/>
         </w:rPr>
-        <w:t>1. Extrait du DUERP avant rÃ©Ã©valuation â€” situation au 15/09/2026</w:t>
+        <w:t>1. Extrait du DUERP avant réévaluation — situation au 15/09/2026</w:t>
       </w:r>
     </w:p>
     <w:tbl>
@@ -112,7 +112,7 @@
                 <w:color w:val="000000"/>
                 <w:sz w:val="15"/>
               </w:rPr>
-              <w:t>UnitÃ© de travail</w:t>
+              <w:t>Unité de travail</w:t>
             </w:r>
           </w:p>
         </w:tc>
@@ -160,7 +160,7 @@
                 <w:color w:val="000000"/>
                 <w:sz w:val="15"/>
               </w:rPr>
-              <w:t>Risque identifiÃ©</w:t>
+              <w:t>Risque identifié</w:t>
             </w:r>
           </w:p>
         </w:tc>
@@ -184,7 +184,7 @@
                 <w:color w:val="000000"/>
                 <w:sz w:val="15"/>
               </w:rPr>
-              <w:t>Mesures indiquÃ©es dans ancien DUERP</w:t>
+              <w:t>Mesures indiquées dans ancien DUERP</w:t>
             </w:r>
           </w:p>
         </w:tc>
@@ -208,7 +208,7 @@
                 <w:color w:val="000000"/>
                 <w:sz w:val="15"/>
               </w:rPr>
-              <w:t>Ã‰valuation prÃ©cÃ©dente</w:t>
+              <w:t>Évaluation précédente</w:t>
             </w:r>
           </w:p>
         </w:tc>
@@ -312,7 +312,7 @@
                 <w:color w:val="000000"/>
                 <w:sz w:val="15"/>
               </w:rPr>
-              <w:t>Protecteur ; arrÃªt urgence ; consignes</w:t>
+              <w:t>Protecteur ; arrêt urgence ; consignes</w:t>
             </w:r>
           </w:p>
         </w:tc>
@@ -392,7 +392,7 @@
                 <w:color w:val="000000"/>
                 <w:sz w:val="15"/>
               </w:rPr>
-              <w:t>Gestes rÃ©pÃ©titifs et posture</w:t>
+              <w:t>Gestes répétitifs et posture</w:t>
             </w:r>
           </w:p>
         </w:tc>
@@ -440,7 +440,7 @@
                 <w:color w:val="000000"/>
                 <w:sz w:val="15"/>
               </w:rPr>
-              <w:t>SiÃ¨ges rÃ©glables ; pauses libres</w:t>
+              <w:t>Sièges réglables ; pauses libres</w:t>
             </w:r>
           </w:p>
         </w:tc>
@@ -496,7 +496,7 @@
                 <w:color w:val="000000"/>
                 <w:sz w:val="15"/>
               </w:rPr>
-              <w:t>RÃ©ception / stock</w:t>
+              <w:t>Réception / stock</w:t>
             </w:r>
           </w:p>
         </w:tc>
@@ -624,7 +624,7 @@
                 <w:color w:val="000000"/>
                 <w:sz w:val="15"/>
               </w:rPr>
-              <w:t>RÃ©ception / stock</w:t>
+              <w:t>Réception / stock</w:t>
             </w:r>
           </w:p>
         </w:tc>
@@ -752,7 +752,7 @@
                 <w:color w:val="000000"/>
                 <w:sz w:val="15"/>
               </w:rPr>
-              <w:t>RÃ©ception / stock</w:t>
+              <w:t>Réception / stock</w:t>
             </w:r>
           </w:p>
         </w:tc>
@@ -776,7 +776,7 @@
                 <w:color w:val="000000"/>
                 <w:sz w:val="15"/>
               </w:rPr>
-              <w:t>RÃ©ception et stabilitÃ© des charges</w:t>
+              <w:t>Réception et stabilité des charges</w:t>
             </w:r>
           </w:p>
         </w:tc>
@@ -824,7 +824,7 @@
                 <w:color w:val="000000"/>
                 <w:sz w:val="15"/>
               </w:rPr>
-              <w:t>ContrÃ´le visuel des palettes</w:t>
+              <w:t>Contrôle visuel des palettes</w:t>
             </w:r>
           </w:p>
         </w:tc>
@@ -880,7 +880,7 @@
                 <w:color w:val="000000"/>
                 <w:sz w:val="15"/>
               </w:rPr>
-              <w:t>E-commerce / prÃ©paration</w:t>
+              <w:t>E-commerce / préparation</w:t>
             </w:r>
           </w:p>
         </w:tc>
@@ -904,7 +904,7 @@
                 <w:color w:val="000000"/>
                 <w:sz w:val="15"/>
               </w:rPr>
-              <w:t>Postures, rÃ©pÃ©titivitÃ©, table fixe</w:t>
+              <w:t>Postures, répétitivité, table fixe</w:t>
             </w:r>
           </w:p>
         </w:tc>
@@ -1008,7 +1008,7 @@
                 <w:color w:val="000000"/>
                 <w:sz w:val="15"/>
               </w:rPr>
-              <w:t>E-commerce / prÃ©paration</w:t>
+              <w:t>E-commerce / préparation</w:t>
             </w:r>
           </w:p>
         </w:tc>
@@ -1080,7 +1080,7 @@
                 <w:color w:val="000000"/>
                 <w:sz w:val="15"/>
               </w:rPr>
-              <w:t>DÃ©marche 5S en cours</w:t>
+              <w:t>Démarche 5S en cours</w:t>
             </w:r>
           </w:p>
         </w:tc>
@@ -1160,7 +1160,7 @@
                 <w:color w:val="000000"/>
                 <w:sz w:val="15"/>
               </w:rPr>
-              <w:t>Sol et zone entrÃ©e</w:t>
+              <w:t>Sol et zone entrée</w:t>
             </w:r>
           </w:p>
         </w:tc>
@@ -1288,7 +1288,7 @@
                 <w:color w:val="000000"/>
                 <w:sz w:val="15"/>
               </w:rPr>
-              <w:t>RÃ©serve et Ã©tagÃ¨res hautes</w:t>
+              <w:t>Réserve et étagères hautes</w:t>
             </w:r>
           </w:p>
         </w:tc>
@@ -1390,7 +1390,7 @@
           <w:color w:val="000000"/>
           <w:sz w:val="18"/>
         </w:rPr>
-        <w:t>Lecture : la cotation prÃ©cÃ©dente constitue seulement un repÃ¨re historique. Les mesures inscrites au document ne prouvent ni leur disponibilitÃ© rÃ©elle, ni leur utilisation, ni leur efficacitÃ©.</w:t>
+        <w:t>Lecture : la cotation précédente constitue seulement un repère historique. Les mesures inscrites au document ne prouvent ni leur disponibilité réelle, ni leur utilisation, ni leur efficacité.</w:t>
       </w:r>
     </w:p>
     <w:p>
@@ -1426,7 +1426,7 @@
           <w:color w:val="000000"/>
           <w:sz w:val="28"/>
         </w:rPr>
-        <w:t>2. Historique et Ã©tat des mesures de prÃ©vention</w:t>
+        <w:t>2. Historique et état des mesures de prévention</w:t>
       </w:r>
     </w:p>
     <w:p>
@@ -1443,7 +1443,7 @@
           <w:color w:val="000000"/>
           <w:sz w:val="19"/>
         </w:rPr>
-        <w:t>Croisez les dates des Ã©vÃ©nements de R02 avec celles des mesures. Une mesure mise en Å“uvre aprÃ¨s un Ã©vÃ©nement ne peut pas expliquer la maÃ®trise antÃ©rieure du risque. Une mesure prÃ©vue mais non rÃ©alisÃ©e ne rÃ©duit pas le risque actuel. Une mesure en place doit encore Ãªtre Ã©valuÃ©e.</w:t>
+        <w:t>Croisez les dates des événements de R02 avec celles des mesures. Une mesure mise en œuvre après un événement ne peut pas expliquer la maîtrise antérieure du risque. Une mesure prévue mais non réalisée ne réduit pas le risque actuel. Une mesure en place doit encore être évaluée.</w:t>
       </w:r>
     </w:p>
     <w:tbl>
@@ -1544,7 +1544,7 @@
                 <w:color w:val="000000"/>
                 <w:sz w:val="14"/>
               </w:rPr>
-              <w:t>Ã‰lÃ©ment efficacitÃ©</w:t>
+              <w:t>Élément efficacité</w:t>
             </w:r>
           </w:p>
         </w:tc>
@@ -1620,7 +1620,7 @@
                 <w:color w:val="000000"/>
                 <w:sz w:val="14"/>
               </w:rPr>
-              <w:t>Protecteur â€” 02/09/2024, en service</w:t>
+              <w:t>Protecteur — 02/09/2024, en service</w:t>
             </w:r>
           </w:p>
         </w:tc>
@@ -1642,7 +1642,7 @@
                 <w:color w:val="000000"/>
                 <w:sz w:val="14"/>
               </w:rPr>
-              <w:t>Presque-accident 19/01/2026 lors dÃ©gagement tissu</w:t>
+              <w:t>Presque-accident 19/01/2026 lors dégagement tissu</w:t>
             </w:r>
           </w:p>
         </w:tc>
@@ -1664,7 +1664,7 @@
                 <w:color w:val="000000"/>
                 <w:sz w:val="14"/>
               </w:rPr>
-              <w:t>EfficacitÃ© Ã  approfondir</w:t>
+              <w:t>Efficacité à approfondir</w:t>
             </w:r>
           </w:p>
         </w:tc>
@@ -1716,7 +1716,7 @@
                 <w:color w:val="000000"/>
                 <w:sz w:val="14"/>
               </w:rPr>
-              <w:t>ArrÃªt urgence â€” 02/09/2024 ; maintenance 05/10/2026</w:t>
+              <w:t>Arrêt urgence — 02/09/2024 ; maintenance 05/10/2026</w:t>
             </w:r>
           </w:p>
         </w:tc>
@@ -1738,7 +1738,7 @@
                 <w:color w:val="000000"/>
                 <w:sz w:val="14"/>
               </w:rPr>
-              <w:t>Test 03/09/2026 : rÃ©action trop longue</w:t>
+              <w:t>Test 03/09/2026 : réaction trop longue</w:t>
             </w:r>
           </w:p>
         </w:tc>
@@ -1760,7 +1760,7 @@
                 <w:color w:val="000000"/>
                 <w:sz w:val="14"/>
               </w:rPr>
-              <w:t>Anomalie connue ; correction Ã  vÃ©rifier</w:t>
+              <w:t>Anomalie connue ; correction à vérifier</w:t>
             </w:r>
           </w:p>
         </w:tc>
@@ -1812,7 +1812,7 @@
                 <w:color w:val="000000"/>
                 <w:sz w:val="14"/>
               </w:rPr>
-              <w:t>SiÃ¨ges rÃ©glables â€” 10/11/2025</w:t>
+              <w:t>Sièges réglables — 10/11/2025</w:t>
             </w:r>
           </w:p>
         </w:tc>
@@ -1834,7 +1834,7 @@
                 <w:color w:val="000000"/>
                 <w:sz w:val="14"/>
               </w:rPr>
-              <w:t>Douleurs 03/02 et 09/07 ; rÃ©glages non tracÃ©s</w:t>
+              <w:t>Douleurs 03/02 et 09/07 ; réglages non tracés</w:t>
             </w:r>
           </w:p>
         </w:tc>
@@ -1856,7 +1856,7 @@
                 <w:color w:val="000000"/>
                 <w:sz w:val="14"/>
               </w:rPr>
-              <w:t>PrÃ©sence ne prouve pas efficacitÃ©</w:t>
+              <w:t>Présence ne prouve pas efficacité</w:t>
             </w:r>
           </w:p>
         </w:tc>
@@ -1886,7 +1886,7 @@
                 <w:color w:val="000000"/>
                 <w:sz w:val="14"/>
               </w:rPr>
-              <w:t>RÃ©ception manutention</w:t>
+              <w:t>Réception manutention</w:t>
             </w:r>
           </w:p>
         </w:tc>
@@ -1908,7 +1908,7 @@
                 <w:color w:val="000000"/>
                 <w:sz w:val="14"/>
               </w:rPr>
-              <w:t>Diable / chariots â€” 15/06/2025</w:t>
+              <w:t>Diable / chariots — 15/06/2025</w:t>
             </w:r>
           </w:p>
         </w:tc>
@@ -1930,7 +1930,7 @@
                 <w:color w:val="000000"/>
                 <w:sz w:val="14"/>
               </w:rPr>
-              <w:t>Ã‰vÃ©nement 26/02 : diable Ã©loignÃ©</w:t>
+              <w:t>Événement 26/02 : diable éloigné</w:t>
             </w:r>
           </w:p>
         </w:tc>
@@ -1952,7 +1952,7 @@
                 <w:color w:val="000000"/>
                 <w:sz w:val="14"/>
               </w:rPr>
-              <w:t>AccessibilitÃ© rÃ©elle Ã  vÃ©rifier</w:t>
+              <w:t>Accessibilité réelle à vérifier</w:t>
             </w:r>
           </w:p>
         </w:tc>
@@ -1982,7 +1982,7 @@
                 <w:color w:val="000000"/>
                 <w:sz w:val="14"/>
               </w:rPr>
-              <w:t>RÃ©ception circulation</w:t>
+              <w:t>Réception circulation</w:t>
             </w:r>
           </w:p>
         </w:tc>
@@ -2004,7 +2004,7 @@
                 <w:color w:val="000000"/>
                 <w:sz w:val="14"/>
               </w:rPr>
-              <w:t>Marquage â€” 15/05/2026, partiel</w:t>
+              <w:t>Marquage — 15/05/2026, partiel</w:t>
             </w:r>
           </w:p>
         </w:tc>
@@ -2026,7 +2026,7 @@
                 <w:color w:val="000000"/>
                 <w:sz w:val="14"/>
               </w:rPr>
-              <w:t>Presque-accident 28/05 dans allÃ©e encombrÃ©e</w:t>
+              <w:t>Presque-accident 28/05 dans allée encombrée</w:t>
             </w:r>
           </w:p>
         </w:tc>
@@ -2078,7 +2078,7 @@
                 <w:color w:val="000000"/>
                 <w:sz w:val="14"/>
               </w:rPr>
-              <w:t>RÃ©ception chute objet</w:t>
+              <w:t>Réception chute objet</w:t>
             </w:r>
           </w:p>
         </w:tc>
@@ -2100,7 +2100,7 @@
                 <w:color w:val="000000"/>
                 <w:sz w:val="14"/>
               </w:rPr>
-              <w:t>ContrÃ´le palettes â€” 01/08/2026, aprÃ¨s Ã©vÃ©nement 24/07</w:t>
+              <w:t>Contrôle palettes — 01/08/2026, après événement 24/07</w:t>
             </w:r>
           </w:p>
         </w:tc>
@@ -2122,7 +2122,7 @@
                 <w:color w:val="000000"/>
                 <w:sz w:val="14"/>
               </w:rPr>
-              <w:t>Aucun Ã©vÃ©nement ultÃ©rieur disponible</w:t>
+              <w:t>Aucun événement ultérieur disponible</w:t>
             </w:r>
           </w:p>
         </w:tc>
@@ -2144,7 +2144,7 @@
                 <w:color w:val="000000"/>
                 <w:sz w:val="14"/>
               </w:rPr>
-              <w:t>Trop tÃ´t pour conclure</w:t>
+              <w:t>Trop tôt pour conclure</w:t>
             </w:r>
           </w:p>
         </w:tc>
@@ -2196,7 +2196,7 @@
                 <w:color w:val="000000"/>
                 <w:sz w:val="14"/>
               </w:rPr>
-              <w:t>Rappel ergonomique â€” 15/04/2026</w:t>
+              <w:t>Rappel ergonomique — 15/04/2026</w:t>
             </w:r>
           </w:p>
         </w:tc>
@@ -2218,7 +2218,7 @@
                 <w:color w:val="000000"/>
                 <w:sz w:val="14"/>
               </w:rPr>
-              <w:t>GÃªne lombaire 29/04</w:t>
+              <w:t>Gêne lombaire 29/04</w:t>
             </w:r>
           </w:p>
         </w:tc>
@@ -2240,7 +2240,7 @@
                 <w:color w:val="000000"/>
                 <w:sz w:val="14"/>
               </w:rPr>
-              <w:t>EfficacitÃ© Ã  vÃ©rifier</w:t>
+              <w:t>Efficacité à vérifier</w:t>
             </w:r>
           </w:p>
         </w:tc>
@@ -2292,7 +2292,7 @@
                 <w:color w:val="000000"/>
                 <w:sz w:val="14"/>
               </w:rPr>
-              <w:t>5S â€” 01/09/2026, pilote</w:t>
+              <w:t>5S — 01/09/2026, pilote</w:t>
             </w:r>
           </w:p>
         </w:tc>
@@ -2336,7 +2336,7 @@
                 <w:color w:val="000000"/>
                 <w:sz w:val="14"/>
               </w:rPr>
-              <w:t>MaÃ®trise non dÃ©montrÃ©e</w:t>
+              <w:t>Maîtrise non démontrée</w:t>
             </w:r>
           </w:p>
         </w:tc>
@@ -2388,7 +2388,7 @@
                 <w:color w:val="000000"/>
                 <w:sz w:val="14"/>
               </w:rPr>
-              <w:t>Tapis â€” 01/10/2024</w:t>
+              <w:t>Tapis — 01/10/2024</w:t>
             </w:r>
           </w:p>
         </w:tc>
@@ -2484,7 +2484,7 @@
                 <w:color w:val="000000"/>
                 <w:sz w:val="14"/>
               </w:rPr>
-              <w:t>Escabeau â€” 01/10/2025, autre rÃ©serve</w:t>
+              <w:t>Escabeau — 01/10/2025, autre réserve</w:t>
             </w:r>
           </w:p>
         </w:tc>
@@ -2506,7 +2506,7 @@
                 <w:color w:val="000000"/>
                 <w:sz w:val="14"/>
               </w:rPr>
-              <w:t>Ã‰vÃ©nement 25/08 avec tabouret</w:t>
+              <w:t>Événement 25/08 avec tabouret</w:t>
             </w:r>
           </w:p>
         </w:tc>
@@ -2528,7 +2528,7 @@
                 <w:color w:val="000000"/>
                 <w:sz w:val="14"/>
               </w:rPr>
-              <w:t>AccessibilitÃ© insuffisante</w:t>
+              <w:t>Accessibilité insuffisante</w:t>
             </w:r>
           </w:p>
         </w:tc>
@@ -2576,7 +2576,7 @@
           <w:color w:val="000000"/>
           <w:sz w:val="28"/>
         </w:rPr>
-        <w:t>3. Ã‰chelle de cotation utilisÃ©e dans le TP</w:t>
+        <w:t>3. Échelle de cotation utilisée dans le TP</w:t>
       </w:r>
     </w:p>
     <w:p>
@@ -2593,7 +2593,7 @@
           <w:color w:val="000000"/>
           <w:sz w:val="19"/>
         </w:rPr>
-        <w:t>La cotation est une mÃ©thode interne de priorisation. La frÃ©quence exposition est un indice pour apprÃ©cier P ; elle ne se confond pas avec P. La gravitÃ© correspond au dommage potentiel plausible, pas seulement au dommage observÃ© lors du dernier Ã©vÃ©nement.</w:t>
+        <w:t>La cotation est une méthode interne de priorisation. La fréquence exposition est un indice pour apprécier P ; elle ne se confond pas avec P. La gravité correspond au dommage potentiel plausible, pas seulement au dommage observé lors du dernier événement.</w:t>
       </w:r>
     </w:p>
     <w:tbl>
@@ -2669,7 +2669,7 @@
                 <w:color w:val="000000"/>
                 <w:sz w:val="17"/>
               </w:rPr>
-              <w:t>ProbabilitÃ© / vraisemblance</w:t>
+              <w:t>Probabilité / vraisemblance</w:t>
             </w:r>
           </w:p>
         </w:tc>
@@ -2693,7 +2693,7 @@
                 <w:color w:val="000000"/>
                 <w:sz w:val="17"/>
               </w:rPr>
-              <w:t>GravitÃ© potentielle</w:t>
+              <w:t>Gravité potentielle</w:t>
             </w:r>
           </w:p>
         </w:tc>
@@ -2767,7 +2767,7 @@
                 <w:color w:val="000000"/>
                 <w:sz w:val="17"/>
               </w:rPr>
-              <w:t>Effet faible ou dommage rÃ©versible sans arrÃªt</w:t>
+              <w:t>Effet faible ou dommage réversible sans arrêt</w:t>
             </w:r>
           </w:p>
         </w:tc>
@@ -2841,7 +2841,7 @@
                 <w:color w:val="000000"/>
                 <w:sz w:val="17"/>
               </w:rPr>
-              <w:t>Dommage limitÃ©, soins ou arrÃªt court</w:t>
+              <w:t>Dommage limité, soins ou arrêt court</w:t>
             </w:r>
           </w:p>
         </w:tc>
@@ -2989,7 +2989,7 @@
                 <w:color w:val="000000"/>
                 <w:sz w:val="17"/>
               </w:rPr>
-              <w:t>Dommage grave / arrÃªt important</w:t>
+              <w:t>Dommage grave / arrêt important</w:t>
             </w:r>
           </w:p>
         </w:tc>
@@ -3041,7 +3041,7 @@
                 <w:color w:val="000000"/>
                 <w:sz w:val="17"/>
               </w:rPr>
-              <w:t>TrÃ¨s probable / rÃ©currente</w:t>
+              <w:t>Très probable / récurrente</w:t>
             </w:r>
           </w:p>
         </w:tc>
@@ -3063,7 +3063,7 @@
                 <w:color w:val="000000"/>
                 <w:sz w:val="17"/>
               </w:rPr>
-              <w:t>Dommage critique : incapacitÃ©, risque vital ou consÃ©quence majeure</w:t>
+              <w:t>Dommage critique : incapacité, risque vital ou conséquence majeure</w:t>
             </w:r>
           </w:p>
         </w:tc>
@@ -3094,7 +3094,7 @@
           <w:color w:val="C00000"/>
           <w:sz w:val="19"/>
         </w:rPr>
-        <w:t>RÃˆGLE DE VIGILANCE â€” Tout risque de gravitÃ© 5 doit faire objet dâ€™un examen spÃ©cifique, mÃªme si sa probabilitÃ© est faible.</w:t>
+        <w:t>RÈGLE DE VIGILANCE — Tout risque de gravité 5 doit faire objet d’un examen spécifique, même si sa probabilité est faible.</w:t>
       </w:r>
     </w:p>
     <w:p>
@@ -3113,7 +3113,7 @@
           <w:color w:val="000000"/>
           <w:sz w:val="28"/>
         </w:rPr>
-        <w:t>4. HiÃ©rarchie pratique des actions Ã  discuter</w:t>
+        <w:t>4. Hiérarchie pratique des actions à discuter</w:t>
       </w:r>
     </w:p>
     <w:p>
@@ -3131,7 +3131,7 @@
           <w:color w:val="000000"/>
           <w:sz w:val="19"/>
         </w:rPr>
-        <w:t>â€¢ Supprimer le danger ou Ã©viter exposition lorsquâ€™une solution rÃ©aliste existe.</w:t>
+        <w:t>• Supprimer le danger ou éviter exposition lorsqu’une solution réaliste existe.</w:t>
       </w:r>
     </w:p>
     <w:p>
@@ -3149,7 +3149,7 @@
           <w:color w:val="000000"/>
           <w:sz w:val="19"/>
         </w:rPr>
-        <w:t>â€¢ PrivilÃ©gier la protection collective et organisationnelle avant de compter uniquement sur un Ã©quipement individuel.</w:t>
+        <w:t>• Privilégier la protection collective et organisationnelle avant de compter uniquement sur un équipement individuel.</w:t>
       </w:r>
     </w:p>
     <w:p>
@@ -3167,7 +3167,7 @@
           <w:color w:val="000000"/>
           <w:sz w:val="19"/>
         </w:rPr>
-        <w:t>â€¢ DÃ©finir un responsable, un dÃ©lai, une preuve de rÃ©alisation et un indicateur efficacitÃ© pour chaque action.</w:t>
+        <w:t>• Définir un responsable, un délai, une preuve de réalisation et un indicateur efficacité pour chaque action.</w:t>
       </w:r>
     </w:p>
     <w:p>
@@ -3184,7 +3184,7 @@
           <w:color w:val="000000"/>
           <w:sz w:val="19"/>
         </w:rPr>
-        <w:t>â€¢ PrÃ©voir la date du nouvel examen du risque aprÃ¨s mise en Å“uvre.</w:t>
+        <w:t>• Prévoir la date du nouvel examen du risque après mise en œuvre.</w:t>
       </w:r>
     </w:p>
     <w:p>
@@ -3203,7 +3203,7 @@
           <w:color w:val="000000"/>
           <w:sz w:val="28"/>
         </w:rPr>
-        <w:t>5. Point de droit Ã  vÃ©rifier</w:t>
+        <w:t>5. Point de droit à vérifier</w:t>
       </w:r>
     </w:p>
     <w:p>
@@ -3221,7 +3221,7 @@
           <w:color w:val="000000"/>
           <w:sz w:val="19"/>
         </w:rPr>
-        <w:t>Pour la tÃ¢che 9, vÃ©rifiez sur une source institutionnelle les cas de mise Ã  jour du DUERP ainsi que la conservation et la traÃ§abilitÃ© des versions successives. Relevez la rÃ¨gle utile, citez la source et datez votre consultation. Une recherche libre nâ€™est pas attendue.</w:t>
+        <w:t>Pour la tâche 9, vérifiez sur une source institutionnelle les cas de mise à jour du DUERP ainsi que la conservation et la traçabilité des versions successives. Relevez la règle utile, citez la source et datez votre consultation. Une recherche libre n’est pas attendue.</w:t>
       </w:r>
     </w:p>
     <w:p>
@@ -3239,7 +3239,7 @@
           <w:color w:val="000000"/>
           <w:sz w:val="18"/>
         </w:rPr>
-        <w:t>Sources ciblÃ©es : Code du travail, art. R4121-2 et R4121-4 sur LÃ©gifrance ; MinistÃ¨re du Travail â€” page DUERP.</w:t>
+        <w:t>Sources ciblées : Code du travail, art. R4121-2 et R4121-4 sur Légifrance ; Ministère du Travail — page DUERP.</w:t>
       </w:r>
     </w:p>
     <w:p>
@@ -3257,7 +3257,7 @@
           <w:color w:val="000000"/>
           <w:sz w:val="17"/>
         </w:rPr>
-        <w:t>LÃ©gifrance R4121-2 : https://www.legifrance.gouv.fr/codes/article_lc/LEGIARTI000045386446</w:t>
+        <w:t>Légifrance R4121-2 : https://www.legifrance.gouv.fr/codes/article_lc/LEGIARTI000045386446</w:t>
       </w:r>
     </w:p>
     <w:p>
@@ -3275,7 +3275,7 @@
           <w:color w:val="000000"/>
           <w:sz w:val="17"/>
         </w:rPr>
-        <w:t>MinistÃ¨re du Travail â€” DUERP : https://travail-emploi.gouv.fr/le-document-unique-devaluation-des-risques-professionnels-duerp</w:t>
+        <w:t>Ministère du Travail — DUERP : https://travail-emploi.gouv.fr/le-document-unique-devaluation-des-risques-professionnels-duerp</w:t>
       </w:r>
     </w:p>
     <w:p>

</xml_diff>